<commit_message>
docs: de-brand exec summary from Teams to generic large-scale web app
Remove all Microsoft Teams / Microsoft 365 product references from the
VP executive summary. Document now describes the problem and solution in
terms of any large-scale web application (50,000+ modules), making it
appropriate for a broader audience and independent of any specific product.

- Title: 'Large-Scale Web Applications' (was 'Microsoft Teams')
- Problem framing: 'A large-scale web application at this tier' (was 'Teams is...')
- Cloudpack reference: 'an existing internal project' (was 'Microsoft 365 properties')
- All 'Teams scale' → 'this scale' / '50,000+ modules'

🤖 Generated with [Amplifier](https://github.com/microsoft/amplifier)

Co-Authored-By: Amplifier <240397093+microsoft-amplifier@users.noreply.github.com>
</commit_message>
<xml_diff>
--- a/docs/wundler-executive-summary.docx
+++ b/docs/wundler-executive-summary.docx
@@ -2,13 +2,13 @@
 <file path=word/document.xml><?xml version="1.0" encoding="utf-8"?>
 <w:document xmlns:w="http://schemas.openxmlformats.org/wordprocessingml/2006/main" xmlns:m="http://schemas.openxmlformats.org/officeDocument/2006/math" xmlns:r="http://schemas.openxmlformats.org/officeDocument/2006/relationships" xmlns:o="urn:schemas-microsoft-com:office:office" xmlns:v="urn:schemas-microsoft-com:vml" xmlns:w10="urn:schemas-microsoft-com:office:word" xmlns:a="http://schemas.openxmlformats.org/drawingml/2006/main" xmlns:pic="http://schemas.openxmlformats.org/drawingml/2006/picture" xmlns:wp="http://schemas.openxmlformats.org/drawingml/2006/wordprocessingDrawing">
   <w:body>
-    <w:bookmarkStart w:id="18" w:name="Xfc06c4cb1659450fafba898c2dbe9a30010b86e"/>
+    <w:bookmarkStart w:id="18" w:name="X49fc28c0d53b5268085f44968a24182f73f958f"/>
     <w:p>
       <w:pPr>
         <w:pStyle w:val="Heading1"/>
       </w:pPr>
       <w:r>
-        <w:t xml:space="preserve">Wundler: Next-Generation Build Infrastructure for Microsoft Teams</w:t>
+        <w:t xml:space="preserve">Wundler: Next-Generation Build Infrastructure for Large-Scale Web Applications</w:t>
       </w:r>
     </w:p>
     <w:bookmarkStart w:id="9" w:name="executive-summary"/>
@@ -25,7 +25,7 @@
         <w:pStyle w:val="FirstParagraph"/>
       </w:pPr>
       <w:r>
-        <w:t xml:space="preserve">Microsoft Teams has outgrown the architectural assumptions of every available web build tool. Build times and developer iteration latency now degrade with every module added, and no amount of faster hardware will reverse the trend — the bottleneck is architectural, not computational.</w:t>
+        <w:t xml:space="preserve">Large-scale web applications have outgrown the architectural assumptions of every available web build tool. Build times and developer iteration latency now degrade with every module added, and no amount of faster hardware will reverse the trend — the bottleneck is architectural, not computational.</w:t>
       </w:r>
       <w:r>
         <w:t xml:space="preserve"> </w:t>
@@ -59,7 +59,7 @@
         <w:pStyle w:val="FirstParagraph"/>
       </w:pPr>
       <w:r>
-        <w:t xml:space="preserve">Teams is a 50,000+ module application, and every one of those modules is re-analyzed on every build. CI builds are measured in tens of minutes. Developers experience hot-reload delays significant enough that they break flow on every save. Across a development organization of Teams’ size, this compounds into thousands of engineer-hours lost per month — and it is getting worse linearly as the product grows. The cost is not theoretical; it shows up directly in feature throughput, time-to-mitigate for production incidents, and the increasing reluctance of teams to take on cross-cutting work that triggers large rebuild surfaces.</w:t>
+        <w:t xml:space="preserve">A large-scale web application at this tier can easily accumulate 50,000 or more modules, and every one of those modules is re-analyzed on every build. CI builds are measured in tens of minutes. Developers experience hot-reload delays significant enough that they break flow on every save. Across a development organization of this size, this compounds into thousands of engineer-hours lost per month — and it is getting worse linearly as the product grows. The cost is not theoretical; it shows up directly in feature throughput, time-to-mitigate for production incidents, and the increasing reluctance of teams to take on cross-cutting work that triggers large rebuild surfaces.</w:t>
       </w:r>
     </w:p>
     <w:p>
@@ -85,7 +85,7 @@
         <w:pStyle w:val="FirstParagraph"/>
       </w:pPr>
       <w:r>
-        <w:t xml:space="preserve">Every modern web build tool — Vite, webpack, esbuild, Rspack, Rolldown — shares the same foundational assumption: start from scratch, analyze the entire module graph, then produce an output. Each successive generation has made that traversal faster, but the work itself still scales linearly with the size of the application. Teams has crossed the threshold where linear is no longer fast enough.</w:t>
+        <w:t xml:space="preserve">Every modern web build tool — Vite, webpack, esbuild, Rspack, Rolldown — shares the same foundational assumption: start from scratch, analyze the entire module graph, then produce an output. Each successive generation has made that traversal faster, but the work itself still scales linearly with the size of the application. Applications at this scale have crossed the threshold where linear is no longer fast enough.</w:t>
       </w:r>
     </w:p>
     <w:p>
@@ -93,7 +93,7 @@
         <w:pStyle w:val="BodyText"/>
       </w:pPr>
       <w:r>
-        <w:t xml:space="preserve">Vite specifically deserves mention because it is widely cited as the modern answer. Vite’s contribution was deferring the bundling work in development — but that is a workaround, not a solution. In production, Vite falls back to a full bundle, and at Teams scale that fallback is just as slow as everything else. The development/production divergence introduces its own correctness risks. We need a system that does not have two different pipelines arguing over which one tells the truth.</w:t>
+        <w:t xml:space="preserve">Vite specifically deserves mention because it is widely cited as the modern answer. Vite’s contribution was deferring the bundling work in development — but that is a workaround, not a solution. In production, Vite falls back to a full bundle, and at this scale, that fallback is just as slow as everything else. The development/production divergence introduces its own correctness risks. We need a system that does not have two different pipelines arguing over which one tells the truth.</w:t>
       </w:r>
     </w:p>
     <w:bookmarkEnd w:id="11"/>
@@ -111,7 +111,7 @@
         <w:pStyle w:val="FirstParagraph"/>
       </w:pPr>
       <w:r>
-        <w:t xml:space="preserve">Before proposing new work, we examined Microsoft’s own internal Cloudpack project, which set out to solve a closely related problem for Microsoft 365 properties. Cloudpack independently arrived at three of the conclusions central to Wundler’s design: pre-compute lightweight metadata before any bundling work, decompose the application into independently-buildable units, and stitch results together at runtime rather than at build time. Cloudpack validates the architectural direction. Wundler extends it by solving the production-delivery problem that Cloudpack explicitly deferred and by operating at finer granularity, which preserves correctness guarantees that Cloudpack trades away for speed.</w:t>
+        <w:t xml:space="preserve">Before proposing new work, we examined an existing internal project (Cloudpack) that set out to solve a closely related problem at comparable scale. Cloudpack independently arrived at three of the conclusions central to Wundler’s design: pre-compute lightweight metadata before any bundling work, decompose the application into independently-buildable units, and stitch results together at runtime rather than at build time. Cloudpack validates the architectural direction. Wundler extends it by solving the production-delivery problem that Cloudpack explicitly deferred and by operating at finer granularity, which preserves correctness guarantees that Cloudpack trades away for speed.</w:t>
       </w:r>
     </w:p>
     <w:bookmarkEnd w:id="12"/>
@@ -248,7 +248,7 @@
         <w:rPr>
           <w:rStyle w:val="VerbatimChar"/>
         </w:rPr>
-        <w:t xml:space="preserve">+----------------+   Runs in milliseconds even at Teams scale.</w:t>
+        <w:t xml:space="preserve">+----------------+   Runs in milliseconds even at 50,000+ modules.</w:t>
       </w:r>
       <w:r>
         <w:br/>
@@ -509,7 +509,7 @@
               <w:pStyle w:val="Compact"/>
             </w:pPr>
             <w:r>
-              <w:t xml:space="preserve">Phase 1 summarizer running across full Teams graph</w:t>
+              <w:t xml:space="preserve">Phase 1 summarizer running across the full module graph</w:t>
             </w:r>
           </w:p>
         </w:tc>
@@ -752,7 +752,7 @@
         <w:pStyle w:val="BodyText"/>
       </w:pPr>
       <w:r>
-        <w:t xml:space="preserve">The largest unknown — whether the metadata layer is actually compact enough at Teams scale — is the question the Month 1 validation experiment exists to answer.</w:t>
+        <w:t xml:space="preserve">The largest unknown — whether the metadata layer is actually compact enough at this scale — is the question the Month 1 validation experiment exists to answer.</w:t>
       </w:r>
     </w:p>
     <w:bookmarkEnd w:id="15"/>
@@ -770,7 +770,7 @@
         <w:pStyle w:val="FirstParagraph"/>
       </w:pPr>
       <w:r>
-        <w:t xml:space="preserve">The single most important property of this proposal is that the riskiest assumption is validated first, cheaply. The Month 1 experiment runs Phase 1 across the complete Teams module graph and answers one measurable question: does the metadata fit in roughly 100MB and does it produce within acceptable time bounds? If the answer is yes, the rest of the architecture follows. If the answer is no, we learn that before committing to Phase 2 — and the redesign happens before any further engineering investment. No other approach we are aware of offers a comparable single-measurement gate this early in the lifecycle.</w:t>
+        <w:t xml:space="preserve">The single most important property of this proposal is that the riskiest assumption is validated first, cheaply. The Month 1 experiment runs Phase 1 across the complete module graph and answers one measurable question: does the metadata fit in roughly 100MB and does it produce within acceptable time bounds? If the answer is yes, the rest of the architecture follows. If the answer is no, we learn that before committing to Phase 2 — and the redesign happens before any further engineering investment. No other approach we are aware of offers a comparable single-measurement gate this early in the lifecycle.</w:t>
       </w:r>
     </w:p>
     <w:bookmarkEnd w:id="16"/>
@@ -788,7 +788,7 @@
         <w:pStyle w:val="FirstParagraph"/>
       </w:pPr>
       <w:r>
-        <w:t xml:space="preserve">We are requesting approval to staff one engineer for four weeks to run the Phase 1 validation experiment against the production Teams module graph. The deliverable is a single measurement with a clear pass/fail interpretation, a written report on the result, and a recommendation on whether to proceed to Phase 2. This is the smallest possible commitment that produces decision-quality information about an architectural direction that has the potential to meaningfully change developer velocity and customer-facing performance at Teams scale. We would like to begin within the next sprint.</w:t>
+        <w:t xml:space="preserve">We are requesting approval to staff one engineer for four weeks to run the Phase 1 validation experiment against the full production module graph. The deliverable is a single measurement with a clear pass/fail interpretation, a written report on the result, and a recommendation on whether to proceed to Phase 2. This is the smallest possible commitment that produces decision-quality information about an architectural direction that has the potential to meaningfully change developer velocity and customer-facing performance at this scale. We would like to begin within the next sprint.</w:t>
       </w:r>
     </w:p>
     <w:bookmarkEnd w:id="17"/>

</xml_diff>